<commit_message>
Resume build: losslessly compress the PDF with qpdf when available
Object streams plus max deflate take the PDF from ~77KB to ~51KB with
text, fonts and links unchanged. Skipped if qpdf isn't installed.

Co-Authored-By: Claude Opus 5.5 <noreply@anthropic.com>
Claude-Session: https://claude.ai/code/session_01C3XYGwk6oQRa6HAp7UMiv2
</commit_message>
<xml_diff>
--- a/resume/dist/Benjamin_Crow_Resume.docx
+++ b/resume/dist/Benjamin_Crow_Resume.docx
@@ -50,7 +50,7 @@
         </w:rPr>
         <w:t xml:space="preserve"> | </w:t>
       </w:r>
-      <w:hyperlink w:history="1" r:id="rIdrs78og2nv0tfxwb-uxrsd">
+      <w:hyperlink w:history="1" r:id="rIdn5dnq-zibkel5xrp3kfxq">
         <w:r>
           <w:rPr>
             <w:rFonts w:ascii="Arial" w:cs="Arial" w:eastAsia="Arial" w:hAnsi="Arial"/>
@@ -70,7 +70,7 @@
         </w:rPr>
         <w:t xml:space="preserve"> | </w:t>
       </w:r>
-      <w:hyperlink w:history="1" r:id="rIdbwg823fuidnix74d8yvdu">
+      <w:hyperlink w:history="1" r:id="rIdllyundmcovuyfmjnxa_ys">
         <w:r>
           <w:rPr>
             <w:rFonts w:ascii="Arial" w:cs="Arial" w:eastAsia="Arial" w:hAnsi="Arial"/>
@@ -90,7 +90,7 @@
         </w:rPr>
         <w:t xml:space="preserve"> | </w:t>
       </w:r>
-      <w:hyperlink w:history="1" r:id="rIdijp1dbjvisofnb4r21d7d">
+      <w:hyperlink w:history="1" r:id="rIdohvc1_o3fzd1brexfcgds">
         <w:r>
           <w:rPr>
             <w:rFonts w:ascii="Arial" w:cs="Arial" w:eastAsia="Arial" w:hAnsi="Arial"/>
@@ -110,7 +110,7 @@
         </w:rPr>
         <w:t xml:space="preserve"> | </w:t>
       </w:r>
-      <w:hyperlink w:history="1" r:id="rIdnwa68tne5wdk6kfja-he3">
+      <w:hyperlink w:history="1" r:id="rIdrvvfcgbrwc4qui0xxqrvo">
         <w:r>
           <w:rPr>
             <w:rFonts w:ascii="Arial" w:cs="Arial" w:eastAsia="Arial" w:hAnsi="Arial"/>
@@ -972,7 +972,7 @@
         </w:rPr>
         <w:t xml:space="preserve"> | Live | TypeScript, React, three.js, WebMCP | </w:t>
       </w:r>
-      <w:hyperlink w:history="1" r:id="rIdubdhok2nb4rmoatugr-vy">
+      <w:hyperlink w:history="1" r:id="rIdw4unkjbeufdbhlr_qg6kf">
         <w:r>
           <w:rPr>
             <w:rFonts w:ascii="Arial" w:cs="Arial" w:eastAsia="Arial" w:hAnsi="Arial"/>
@@ -1023,7 +1023,7 @@
         </w:rPr>
         <w:t xml:space="preserve"> | Active development | TypeScript, agent runtime, evaluation | </w:t>
       </w:r>
-      <w:hyperlink w:history="1" r:id="rIdiujrvpbz2cfkvzh6oln1r">
+      <w:hyperlink w:history="1" r:id="rId0qcutrkowrn9n_29jkup-">
         <w:r>
           <w:rPr>
             <w:rFonts w:ascii="Arial" w:cs="Arial" w:eastAsia="Arial" w:hAnsi="Arial"/>
@@ -1074,7 +1074,7 @@
         </w:rPr>
         <w:t xml:space="preserve"> | Active development | Preact, TypeScript, Fastify, MCP, Web Push | </w:t>
       </w:r>
-      <w:hyperlink w:history="1" r:id="rIdv2eygxnlmh_ffyaytbyss">
+      <w:hyperlink w:history="1" r:id="rIdgrbibfzu82khdvhw0mdhj">
         <w:r>
           <w:rPr>
             <w:rFonts w:ascii="Arial" w:cs="Arial" w:eastAsia="Arial" w:hAnsi="Arial"/>
@@ -1125,7 +1125,7 @@
         </w:rPr>
         <w:t xml:space="preserve"> | Live | On-device LLM, WebMCP, tool use | </w:t>
       </w:r>
-      <w:hyperlink w:history="1" r:id="rIdouwfxzez0c0jvslvuzcsv">
+      <w:hyperlink w:history="1" r:id="rIdpw08bueewuzwtrbsbfhnc">
         <w:r>
           <w:rPr>
             <w:rFonts w:ascii="Arial" w:cs="Arial" w:eastAsia="Arial" w:hAnsi="Arial"/>
@@ -1175,7 +1175,7 @@
       <w:pPr>
         <w:spacing w:after="30"/>
       </w:pPr>
-      <w:hyperlink w:history="1" r:id="rIdlbzaiabhimalrfg_zq6jy">
+      <w:hyperlink w:history="1" r:id="rIdebugqdzzw1uqt4khrwppt">
         <w:r>
           <w:rPr>
             <w:rFonts w:ascii="Georgia" w:cs="Georgia" w:eastAsia="Georgia" w:hAnsi="Georgia"/>

</xml_diff>

<commit_message>
Add confirmed skills: prompt engineering, observability, personal evals
- Resume skills: prompt engineering; observability and monitoring;
  evals and fine-tuning marked as personal projects (Ben confirmed)
- Site tools list adds Prompt Engineering and Observability; site agent
  facts note evals and fine-tuning are personal, not at Culture Amp
- Keyword match vs the three Senior AI Engineer ads: 77% -> 87%

Co-Authored-By: Claude Opus 5.5 <noreply@anthropic.com>
Claude-Session: https://claude.ai/code/session_01C3XYGwk6oQRa6HAp7UMiv2
</commit_message>
<xml_diff>
--- a/resume/dist/Benjamin_Crow_Resume.docx
+++ b/resume/dist/Benjamin_Crow_Resume.docx
@@ -50,7 +50,7 @@
         </w:rPr>
         <w:t xml:space="preserve"> | </w:t>
       </w:r>
-      <w:hyperlink w:history="1" r:id="rIdn5dnq-zibkel5xrp3kfxq">
+      <w:hyperlink w:history="1" r:id="rId1zioztd12u7onajxbdwxz">
         <w:r>
           <w:rPr>
             <w:rFonts w:ascii="Arial" w:cs="Arial" w:eastAsia="Arial" w:hAnsi="Arial"/>
@@ -70,7 +70,7 @@
         </w:rPr>
         <w:t xml:space="preserve"> | </w:t>
       </w:r>
-      <w:hyperlink w:history="1" r:id="rIdllyundmcovuyfmjnxa_ys">
+      <w:hyperlink w:history="1" r:id="rId0mezsy0tsl8vsd8e_-8_h">
         <w:r>
           <w:rPr>
             <w:rFonts w:ascii="Arial" w:cs="Arial" w:eastAsia="Arial" w:hAnsi="Arial"/>
@@ -90,7 +90,7 @@
         </w:rPr>
         <w:t xml:space="preserve"> | </w:t>
       </w:r>
-      <w:hyperlink w:history="1" r:id="rIdohvc1_o3fzd1brexfcgds">
+      <w:hyperlink w:history="1" r:id="rIdodrxpoykhyg5tvwqe-pzu">
         <w:r>
           <w:rPr>
             <w:rFonts w:ascii="Arial" w:cs="Arial" w:eastAsia="Arial" w:hAnsi="Arial"/>
@@ -110,7 +110,7 @@
         </w:rPr>
         <w:t xml:space="preserve"> | </w:t>
       </w:r>
-      <w:hyperlink w:history="1" r:id="rIdrvvfcgbrwc4qui0xxqrvo">
+      <w:hyperlink w:history="1" r:id="rIdeodlywhhe4vgqv9dwbvhx">
         <w:r>
           <w:rPr>
             <w:rFonts w:ascii="Arial" w:cs="Arial" w:eastAsia="Arial" w:hAnsi="Arial"/>
@@ -198,7 +198,7 @@
           <w:sz w:val="20"/>
           <w:szCs w:val="20"/>
         </w:rPr>
-        <w:t xml:space="preserve">LLM integration, Agentic systems, Human-in-the-loop design, Tool and function calling, MCP and WebMCP, LangChain, OpenAI API, Claude Code, Context engineering, Harness engineering, Tracing</w:t>
+        <w:t xml:space="preserve">LLM integration, Agentic systems, Human-in-the-loop design, Tool and function calling, MCP and WebMCP, LangChain, OpenAI API, Claude Code, Prompt engineering, Context engineering, Harness engineering, Tracing, Evals and fine-tuning (personal projects)</w:t>
       </w:r>
     </w:p>
     <w:p>
@@ -248,7 +248,7 @@
           <w:sz w:val="20"/>
           <w:szCs w:val="20"/>
         </w:rPr>
-        <w:t xml:space="preserve">PostgreSQL, REST, GraphQL, Kafka, Temporal, AWS, GCP, Docker, CI/CD, LaunchDarkly, Monitoring</w:t>
+        <w:t xml:space="preserve">PostgreSQL, REST, GraphQL, Kafka, Temporal, AWS, GCP, Docker, CI/CD, LaunchDarkly, Observability and monitoring</w:t>
       </w:r>
     </w:p>
     <w:p>
@@ -972,7 +972,7 @@
         </w:rPr>
         <w:t xml:space="preserve"> | Live | TypeScript, React, three.js, WebMCP | </w:t>
       </w:r>
-      <w:hyperlink w:history="1" r:id="rIdw4unkjbeufdbhlr_qg6kf">
+      <w:hyperlink w:history="1" r:id="rIdsyrkjucyuxrwr48fsv69j">
         <w:r>
           <w:rPr>
             <w:rFonts w:ascii="Arial" w:cs="Arial" w:eastAsia="Arial" w:hAnsi="Arial"/>
@@ -1023,7 +1023,7 @@
         </w:rPr>
         <w:t xml:space="preserve"> | Active development | TypeScript, agent runtime, evaluation | </w:t>
       </w:r>
-      <w:hyperlink w:history="1" r:id="rId0qcutrkowrn9n_29jkup-">
+      <w:hyperlink w:history="1" r:id="rId7dhn_htfm1r3l5z_33uqf">
         <w:r>
           <w:rPr>
             <w:rFonts w:ascii="Arial" w:cs="Arial" w:eastAsia="Arial" w:hAnsi="Arial"/>
@@ -1074,7 +1074,7 @@
         </w:rPr>
         <w:t xml:space="preserve"> | Active development | Preact, TypeScript, Fastify, MCP, Web Push | </w:t>
       </w:r>
-      <w:hyperlink w:history="1" r:id="rIdgrbibfzu82khdvhw0mdhj">
+      <w:hyperlink w:history="1" r:id="rIdxd1faxzxywxgjlfkfj54j">
         <w:r>
           <w:rPr>
             <w:rFonts w:ascii="Arial" w:cs="Arial" w:eastAsia="Arial" w:hAnsi="Arial"/>
@@ -1125,7 +1125,7 @@
         </w:rPr>
         <w:t xml:space="preserve"> | Live | On-device LLM, WebMCP, tool use | </w:t>
       </w:r>
-      <w:hyperlink w:history="1" r:id="rIdpw08bueewuzwtrbsbfhnc">
+      <w:hyperlink w:history="1" r:id="rIdygb2drynuftbjsjfnmhoi">
         <w:r>
           <w:rPr>
             <w:rFonts w:ascii="Arial" w:cs="Arial" w:eastAsia="Arial" w:hAnsi="Arial"/>
@@ -1175,7 +1175,7 @@
       <w:pPr>
         <w:spacing w:after="30"/>
       </w:pPr>
-      <w:hyperlink w:history="1" r:id="rIdebugqdzzw1uqt4khrwppt">
+      <w:hyperlink w:history="1" r:id="rId4_k0u6uag70fceuojidi2">
         <w:r>
           <w:rPr>
             <w:rFonts w:ascii="Georgia" w:cs="Georgia" w:eastAsia="Georgia" w:hAnsi="Georgia"/>

</xml_diff>